<commit_message>
docs: Se corrigen requisitos no funcionales
</commit_message>
<xml_diff>
--- a/FASE 2/Evidencias Proyecto/Documentacion/Requisitos no funcionales.docx
+++ b/FASE 2/Evidencias Proyecto/Documentacion/Requisitos no funcionales.docx
@@ -13,7 +13,7 @@
         <w:rPr>
           <w:rFonts w:ascii="Calibri" w:hAnsi="Calibri" w:cs="Calibri"/>
         </w:rPr>
-        <w:t>Requisitos No Funcionales – ErgoSense</w:t>
+        <w:t xml:space="preserve">Requisitos no funcionales – ErgoSense</w:t>
       </w:r>
     </w:p>
     <w:p>
@@ -1819,6 +1819,24 @@
       </w:r>
       <w:bookmarkEnd w:id="3"/>
     </w:p>
+    <w:p>
+      <w:pPr>
+        <w:jc w:val="both"/>
+        <w:rPr>
+          <w:rFonts w:ascii="Calibri" w:hAnsi="Calibri" w:cs="Calibri"/>
+          <w:sz w:val="20"/>
+          <w:szCs w:val="20"/>
+        </w:rPr>
+      </w:pPr>
+      <w:r>
+        <w:rPr>
+          <w:rFonts w:ascii="Calibri" w:hAnsi="Calibri" w:cs="Calibri"/>
+          <w:sz w:val="20"/>
+          <w:szCs w:val="20"/>
+        </w:rPr>
+        <w:t>Requisitos de tiempo de respuesta y uso de recursos, considerando que la aplicación permanece abierta durante la jornada del usuario.</w:t>
+      </w:r>
+    </w:p>
     <w:tbl>
       <w:tblPr>
         <w:tblpPr w:leftFromText="141" w:rightFromText="141" w:vertAnchor="text" w:horzAnchor="margin" w:tblpY="740"/>
@@ -2613,24 +2631,6 @@
     </w:tbl>
     <w:p>
       <w:pPr>
-        <w:jc w:val="both"/>
-        <w:rPr>
-          <w:rFonts w:ascii="Calibri" w:hAnsi="Calibri" w:cs="Calibri"/>
-          <w:sz w:val="20"/>
-          <w:szCs w:val="20"/>
-        </w:rPr>
-      </w:pPr>
-      <w:r>
-        <w:rPr>
-          <w:rFonts w:ascii="Calibri" w:hAnsi="Calibri" w:cs="Calibri"/>
-          <w:sz w:val="20"/>
-          <w:szCs w:val="20"/>
-        </w:rPr>
-        <w:t>Requisitos de tiempo de respuesta y uso de recursos, considerando que la aplicación permanece abierta durante la jornada del usuario.</w:t>
-      </w:r>
-    </w:p>
-    <w:p>
-      <w:pPr>
         <w:pStyle w:val="Heading1"/>
         <w:jc w:val="both"/>
         <w:rPr>
@@ -2645,6 +2645,24 @@
         <w:t>5. Seguridad</w:t>
       </w:r>
       <w:bookmarkEnd w:id="4"/>
+    </w:p>
+    <w:p>
+      <w:pPr>
+        <w:jc w:val="both"/>
+        <w:rPr>
+          <w:rFonts w:ascii="Calibri" w:hAnsi="Calibri" w:cs="Calibri"/>
+          <w:sz w:val="20"/>
+          <w:szCs w:val="20"/>
+        </w:rPr>
+      </w:pPr>
+      <w:r>
+        <w:rPr>
+          <w:rFonts w:ascii="Calibri" w:hAnsi="Calibri" w:cs="Calibri"/>
+          <w:sz w:val="20"/>
+          <w:szCs w:val="20"/>
+        </w:rPr>
+        <w:t>Requisitos para proteger las cuentas de usuario y la información almacenada en el servidor.</w:t>
+      </w:r>
     </w:p>
     <w:tbl>
       <w:tblPr>
@@ -3006,7 +3024,7 @@
                 <w:sz w:val="20"/>
                 <w:szCs w:val="20"/>
               </w:rPr>
-              <w:t xml:space="preserve">Todas las solicitudes a la API desplegada se realizan mediante HTTPS.</w:t>
+              <w:t xml:space="preserve">Todas las solicitudes a la API desplegada se realizan mediante HTTPS; en el entorno de desarrollo local se permite HTTP.</w:t>
             </w:r>
           </w:p>
         </w:tc>
@@ -3131,7 +3149,7 @@
                 <w:sz w:val="20"/>
                 <w:szCs w:val="20"/>
               </w:rPr>
-              <w:t xml:space="preserve">Un token vencido o alterado es rechazado por la API; la sesión se renueva sin volver a ingresar la contraseña mientras el usuario no la cierre.</w:t>
+              <w:t xml:space="preserve">El token de acceso vence a los 60 minutos y el token de renovación a los 30 días o al cerrar sesión; la API rechaza los tokens vencidos, alterados o de una sesión cerrada.</w:t>
             </w:r>
           </w:p>
         </w:tc>
@@ -3564,24 +3582,6 @@
     </w:tbl>
     <w:p>
       <w:pPr>
-        <w:jc w:val="both"/>
-        <w:rPr>
-          <w:rFonts w:ascii="Calibri" w:hAnsi="Calibri" w:cs="Calibri"/>
-          <w:sz w:val="20"/>
-          <w:szCs w:val="20"/>
-        </w:rPr>
-      </w:pPr>
-      <w:r>
-        <w:rPr>
-          <w:rFonts w:ascii="Calibri" w:hAnsi="Calibri" w:cs="Calibri"/>
-          <w:sz w:val="20"/>
-          <w:szCs w:val="20"/>
-        </w:rPr>
-        <w:t>Requisitos para proteger las cuentas de usuario y la información almacenada en el servidor.</w:t>
-      </w:r>
-    </w:p>
-    <w:p>
-      <w:pPr>
         <w:pStyle w:val="Heading1"/>
         <w:jc w:val="both"/>
         <w:rPr>
@@ -3612,7 +3612,7 @@
           <w:sz w:val="20"/>
           <w:szCs w:val="20"/>
         </w:rPr>
-        <w:t xml:space="preserve">ErgoSense utiliza el teclado, el mouse, la cámara y el micrófono del usuario, por lo que debe limitar la información que registra a la estrictamente necesaria, de acuerdo con la normativa chilena de protección de la vida privada (Ley N.º 19.628, 1999).</w:t>
+        <w:t xml:space="preserve">ErgoSense utiliza el teclado, el mouse, la cámara y el micrófono del usuario, por lo que debe limitar la información que registra a la estrictamente necesaria, de acuerdo con la normativa chilena de protección de datos personales (Ley N.º 19.628, 1999; Ley N.º 21.719, 2024), considerando que la Ley N.º 21.719, que moderniza dicha normativa, entra en vigencia el 1 de diciembre de 2026.</w:t>
       </w:r>
     </w:p>
     <w:tbl>
@@ -4473,7 +4473,7 @@
                 <w:sz w:val="20"/>
                 <w:szCs w:val="20"/>
               </w:rPr>
-              <w:t xml:space="preserve">Los mensajes de error indican qué ocurrió y cómo continuar, sin mostrar códigos técnicos.</w:t>
+              <w:t xml:space="preserve">Todos los textos de la interfaz están en español, y los mensajes de error indican qué ocurrió y cómo continuar, sin mostrar códigos técnicos.</w:t>
             </w:r>
           </w:p>
         </w:tc>
@@ -5228,6 +5228,24 @@
       </w:r>
       <w:bookmarkEnd w:id="8"/>
     </w:p>
+    <w:p>
+      <w:pPr>
+        <w:jc w:val="both"/>
+        <w:rPr>
+          <w:rFonts w:ascii="Calibri" w:hAnsi="Calibri" w:cs="Calibri"/>
+          <w:sz w:val="20"/>
+          <w:szCs w:val="20"/>
+        </w:rPr>
+      </w:pPr>
+      <w:r>
+        <w:rPr>
+          <w:rFonts w:ascii="Calibri" w:hAnsi="Calibri" w:cs="Calibri"/>
+          <w:sz w:val="20"/>
+          <w:szCs w:val="20"/>
+        </w:rPr>
+        <w:t xml:space="preserve">Requisitos sobre los entornos en que se ejecuta y se instala ErgoSense.</w:t>
+      </w:r>
+    </w:p>
     <w:tbl>
       <w:tblPr>
         <w:tblpPr w:leftFromText="141" w:rightFromText="141" w:vertAnchor="text" w:horzAnchor="margin" w:tblpY="445"/>
@@ -5893,24 +5911,6 @@
         </w:tc>
       </w:tr>
     </w:tbl>
-    <w:p>
-      <w:pPr>
-        <w:jc w:val="both"/>
-        <w:rPr>
-          <w:rFonts w:ascii="Calibri" w:hAnsi="Calibri" w:cs="Calibri"/>
-          <w:sz w:val="20"/>
-          <w:szCs w:val="20"/>
-        </w:rPr>
-      </w:pPr>
-      <w:r>
-        <w:rPr>
-          <w:rFonts w:ascii="Calibri" w:hAnsi="Calibri" w:cs="Calibri"/>
-          <w:sz w:val="20"/>
-          <w:szCs w:val="20"/>
-        </w:rPr>
-        <w:t xml:space="preserve">Requisitos sobre los entornos en que se ejecuta y se instala ErgoSense.</w:t>
-      </w:r>
-    </w:p>
     <w:p>
       <w:pPr>
         <w:pStyle w:val="Heading1"/>
@@ -6808,6 +6808,25 @@
           <w:szCs w:val="20"/>
         </w:rPr>
         <w:t xml:space="preserve">Ley N.º 19.628 de 1999. Sobre protección de la vida privada. 28 de agosto de 1999. Diario Oficial de la República de Chile.</w:t>
+      </w:r>
+    </w:p>
+    <w:p>
+      <w:pPr>
+        <w:ind w:left="720" w:hanging="720"/>
+        <w:jc w:val="both"/>
+        <w:rPr>
+          <w:rFonts w:ascii="Calibri" w:hAnsi="Calibri" w:cs="Calibri"/>
+          <w:sz w:val="20"/>
+          <w:szCs w:val="20"/>
+        </w:rPr>
+      </w:pPr>
+      <w:r>
+        <w:rPr>
+          <w:rFonts w:ascii="Calibri" w:hAnsi="Calibri" w:cs="Calibri"/>
+          <w:sz w:val="20"/>
+          <w:szCs w:val="20"/>
+        </w:rPr>
+        <w:t xml:space="preserve">Ley N.º 21.719 de 2024. Regula la protección y el tratamiento de los datos personales y crea la Agencia de Protección de Datos Personales. 13 de diciembre de 2024. Diario Oficial de la República de Chile.</w:t>
       </w:r>
     </w:p>
     <w:p>

</xml_diff>